<commit_message>
docs: add LLM evaluation methods documentation
</commit_message>
<xml_diff>
--- a/resources/04-need-of-multiple-evals/03-need-of-multiple-evals.docx
+++ b/resources/04-need-of-multiple-evals/03-need-of-multiple-evals.docx
@@ -2,7 +2,381 @@
 <file path=word/document.xml><?xml version="1.0" encoding="utf-8"?>
 <w:document xmlns:wpc="http://schemas.microsoft.com/office/word/2010/wordprocessingCanvas" xmlns:cx="http://schemas.microsoft.com/office/drawing/2014/chartex" xmlns:cx1="http://schemas.microsoft.com/office/drawing/2015/9/8/chartex" xmlns:cx2="http://schemas.microsoft.com/office/drawing/2015/10/21/chartex" xmlns:cx3="http://schemas.microsoft.com/office/drawing/2016/5/9/chartex" xmlns:cx4="http://schemas.microsoft.com/office/drawing/2016/5/10/chartex" xmlns:cx5="http://schemas.microsoft.com/office/drawing/2016/5/11/chartex" xmlns:cx6="http://schemas.microsoft.com/office/drawing/2016/5/12/chartex" xmlns:cx7="http://schemas.microsoft.com/office/drawing/2016/5/13/chartex" xmlns:cx8="http://schemas.microsoft.com/office/drawing/2016/5/14/chartex" xmlns:mc="http://schemas.openxmlformats.org/markup-compatibility/2006" xmlns:aink="http://schemas.microsoft.com/office/drawing/2016/ink" xmlns:am3d="http://schemas.microsoft.com/office/drawing/2017/model3d" xmlns:o="urn:schemas-microsoft-com:office:office" xmlns:oel="http://schemas.microsoft.com/office/2019/extlst" xmlns:r="http://schemas.openxmlformats.org/officeDocument/2006/relationships" xmlns:m="http://schemas.openxmlformats.org/officeDocument/2006/math" xmlns:v="urn:schemas-microsoft-com:vml" xmlns:wp14="http://schemas.microsoft.com/office/word/2010/wordprocessingDrawing" xmlns:wp="http://schemas.openxmlformats.org/drawingml/2006/wordprocessingDrawing" xmlns:w10="urn:schemas-microsoft-com:office:word" xmlns:w="http://schemas.openxmlformats.org/wordprocessingml/2006/main" xmlns:w14="http://schemas.microsoft.com/office/word/2010/wordml" xmlns:w15="http://schemas.microsoft.com/office/word/2012/wordml" xmlns:w16cei="http://schemas.microsoft.com/office/word/2026/wordml/cei" xmlns:w16cex="http://schemas.microsoft.com/office/word/2018/wordml/cex" xmlns:w16cid="http://schemas.microsoft.com/office/word/2016/wordml/cid" xmlns:w16="http://schemas.microsoft.com/office/word/2018/wordml" xmlns:w16du="http://schemas.microsoft.com/office/word/2023/wordml/word16du" xmlns:w16sdtdh="http://schemas.microsoft.com/office/word/2020/wordml/sdtdatahash" xmlns:w16sdtfl="http://schemas.microsoft.com/office/word/2024/wordml/sdtformatlock" xmlns:w16se="http://schemas.microsoft.com/office/word/2015/wordml/symex" xmlns:wpg="http://schemas.microsoft.com/office/word/2010/wordprocessingGroup" xmlns:wpi="http://schemas.microsoft.com/office/word/2010/wordprocessingInk" xmlns:wne="http://schemas.microsoft.com/office/word/2006/wordml" xmlns:wps="http://schemas.microsoft.com/office/word/2010/wordprocessingShape" mc:Ignorable="w14 w15 w16se w16cid w16 w16cex w16sdtdh w16sdtfl w16du wp14">
   <w:body>
-    <w:p/>
+    <w:p>
+      <w:r>
+        <w:drawing>
+          <wp:inline distT="0" distB="0" distL="0" distR="0" wp14:anchorId="5D4D0B66" wp14:editId="0A324F50">
+            <wp:extent cx="5731510" cy="3716655"/>
+            <wp:effectExtent l="0" t="0" r="2540" b="0"/>
+            <wp:docPr id="811470392" name="Picture 1"/>
+            <wp:cNvGraphicFramePr>
+              <a:graphicFrameLocks xmlns:a="http://schemas.openxmlformats.org/drawingml/2006/main" noChangeAspect="1"/>
+            </wp:cNvGraphicFramePr>
+            <a:graphic xmlns:a="http://schemas.openxmlformats.org/drawingml/2006/main">
+              <a:graphicData uri="http://schemas.openxmlformats.org/drawingml/2006/picture">
+                <pic:pic xmlns:pic="http://schemas.openxmlformats.org/drawingml/2006/picture">
+                  <pic:nvPicPr>
+                    <pic:cNvPr id="811470392" name=""/>
+                    <pic:cNvPicPr/>
+                  </pic:nvPicPr>
+                  <pic:blipFill>
+                    <a:blip r:embed="rId4"/>
+                    <a:stretch>
+                      <a:fillRect/>
+                    </a:stretch>
+                  </pic:blipFill>
+                  <pic:spPr>
+                    <a:xfrm>
+                      <a:off x="0" y="0"/>
+                      <a:ext cx="5731510" cy="3716655"/>
+                    </a:xfrm>
+                    <a:prstGeom prst="rect">
+                      <a:avLst/>
+                    </a:prstGeom>
+                  </pic:spPr>
+                </pic:pic>
+              </a:graphicData>
+            </a:graphic>
+          </wp:inline>
+        </w:drawing>
+      </w:r>
+      <w:r>
+        <w:drawing>
+          <wp:inline distT="0" distB="0" distL="0" distR="0" wp14:anchorId="4D25DB67" wp14:editId="5CCC1593">
+            <wp:extent cx="5731510" cy="4246880"/>
+            <wp:effectExtent l="0" t="0" r="2540" b="1270"/>
+            <wp:docPr id="1005403315" name="Picture 1"/>
+            <wp:cNvGraphicFramePr>
+              <a:graphicFrameLocks xmlns:a="http://schemas.openxmlformats.org/drawingml/2006/main" noChangeAspect="1"/>
+            </wp:cNvGraphicFramePr>
+            <a:graphic xmlns:a="http://schemas.openxmlformats.org/drawingml/2006/main">
+              <a:graphicData uri="http://schemas.openxmlformats.org/drawingml/2006/picture">
+                <pic:pic xmlns:pic="http://schemas.openxmlformats.org/drawingml/2006/picture">
+                  <pic:nvPicPr>
+                    <pic:cNvPr id="1005403315" name=""/>
+                    <pic:cNvPicPr/>
+                  </pic:nvPicPr>
+                  <pic:blipFill>
+                    <a:blip r:embed="rId5"/>
+                    <a:stretch>
+                      <a:fillRect/>
+                    </a:stretch>
+                  </pic:blipFill>
+                  <pic:spPr>
+                    <a:xfrm>
+                      <a:off x="0" y="0"/>
+                      <a:ext cx="5731510" cy="4246880"/>
+                    </a:xfrm>
+                    <a:prstGeom prst="rect">
+                      <a:avLst/>
+                    </a:prstGeom>
+                  </pic:spPr>
+                </pic:pic>
+              </a:graphicData>
+            </a:graphic>
+          </wp:inline>
+        </w:drawing>
+      </w:r>
+      <w:r>
+        <w:lastRenderedPageBreak/>
+        <w:drawing>
+          <wp:inline distT="0" distB="0" distL="0" distR="0" wp14:anchorId="33EEFFE3" wp14:editId="7576D26A">
+            <wp:extent cx="5731510" cy="3025775"/>
+            <wp:effectExtent l="0" t="0" r="2540" b="3175"/>
+            <wp:docPr id="351543761" name="Picture 1"/>
+            <wp:cNvGraphicFramePr>
+              <a:graphicFrameLocks xmlns:a="http://schemas.openxmlformats.org/drawingml/2006/main" noChangeAspect="1"/>
+            </wp:cNvGraphicFramePr>
+            <a:graphic xmlns:a="http://schemas.openxmlformats.org/drawingml/2006/main">
+              <a:graphicData uri="http://schemas.openxmlformats.org/drawingml/2006/picture">
+                <pic:pic xmlns:pic="http://schemas.openxmlformats.org/drawingml/2006/picture">
+                  <pic:nvPicPr>
+                    <pic:cNvPr id="351543761" name=""/>
+                    <pic:cNvPicPr/>
+                  </pic:nvPicPr>
+                  <pic:blipFill>
+                    <a:blip r:embed="rId6"/>
+                    <a:stretch>
+                      <a:fillRect/>
+                    </a:stretch>
+                  </pic:blipFill>
+                  <pic:spPr>
+                    <a:xfrm>
+                      <a:off x="0" y="0"/>
+                      <a:ext cx="5731510" cy="3025775"/>
+                    </a:xfrm>
+                    <a:prstGeom prst="rect">
+                      <a:avLst/>
+                    </a:prstGeom>
+                  </pic:spPr>
+                </pic:pic>
+              </a:graphicData>
+            </a:graphic>
+          </wp:inline>
+        </w:drawing>
+      </w:r>
+      <w:r>
+        <w:drawing>
+          <wp:inline distT="0" distB="0" distL="0" distR="0" wp14:anchorId="0607FBA4" wp14:editId="6BE4727C">
+            <wp:extent cx="5731510" cy="3628390"/>
+            <wp:effectExtent l="0" t="0" r="2540" b="0"/>
+            <wp:docPr id="1815120140" name="Picture 1"/>
+            <wp:cNvGraphicFramePr>
+              <a:graphicFrameLocks xmlns:a="http://schemas.openxmlformats.org/drawingml/2006/main" noChangeAspect="1"/>
+            </wp:cNvGraphicFramePr>
+            <a:graphic xmlns:a="http://schemas.openxmlformats.org/drawingml/2006/main">
+              <a:graphicData uri="http://schemas.openxmlformats.org/drawingml/2006/picture">
+                <pic:pic xmlns:pic="http://schemas.openxmlformats.org/drawingml/2006/picture">
+                  <pic:nvPicPr>
+                    <pic:cNvPr id="1815120140" name=""/>
+                    <pic:cNvPicPr/>
+                  </pic:nvPicPr>
+                  <pic:blipFill>
+                    <a:blip r:embed="rId7"/>
+                    <a:stretch>
+                      <a:fillRect/>
+                    </a:stretch>
+                  </pic:blipFill>
+                  <pic:spPr>
+                    <a:xfrm>
+                      <a:off x="0" y="0"/>
+                      <a:ext cx="5731510" cy="3628390"/>
+                    </a:xfrm>
+                    <a:prstGeom prst="rect">
+                      <a:avLst/>
+                    </a:prstGeom>
+                  </pic:spPr>
+                </pic:pic>
+              </a:graphicData>
+            </a:graphic>
+          </wp:inline>
+        </w:drawing>
+      </w:r>
+      <w:r>
+        <w:lastRenderedPageBreak/>
+        <w:drawing>
+          <wp:inline distT="0" distB="0" distL="0" distR="0" wp14:anchorId="474B3534" wp14:editId="5E87CD27">
+            <wp:extent cx="5731510" cy="3169920"/>
+            <wp:effectExtent l="0" t="0" r="2540" b="0"/>
+            <wp:docPr id="579430669" name="Picture 1"/>
+            <wp:cNvGraphicFramePr>
+              <a:graphicFrameLocks xmlns:a="http://schemas.openxmlformats.org/drawingml/2006/main" noChangeAspect="1"/>
+            </wp:cNvGraphicFramePr>
+            <a:graphic xmlns:a="http://schemas.openxmlformats.org/drawingml/2006/main">
+              <a:graphicData uri="http://schemas.openxmlformats.org/drawingml/2006/picture">
+                <pic:pic xmlns:pic="http://schemas.openxmlformats.org/drawingml/2006/picture">
+                  <pic:nvPicPr>
+                    <pic:cNvPr id="579430669" name=""/>
+                    <pic:cNvPicPr/>
+                  </pic:nvPicPr>
+                  <pic:blipFill>
+                    <a:blip r:embed="rId8"/>
+                    <a:stretch>
+                      <a:fillRect/>
+                    </a:stretch>
+                  </pic:blipFill>
+                  <pic:spPr>
+                    <a:xfrm>
+                      <a:off x="0" y="0"/>
+                      <a:ext cx="5731510" cy="3169920"/>
+                    </a:xfrm>
+                    <a:prstGeom prst="rect">
+                      <a:avLst/>
+                    </a:prstGeom>
+                  </pic:spPr>
+                </pic:pic>
+              </a:graphicData>
+            </a:graphic>
+          </wp:inline>
+        </w:drawing>
+      </w:r>
+      <w:r>
+        <w:drawing>
+          <wp:inline distT="0" distB="0" distL="0" distR="0" wp14:anchorId="7F66BAC0" wp14:editId="3F4890A2">
+            <wp:extent cx="5731510" cy="2402205"/>
+            <wp:effectExtent l="0" t="0" r="2540" b="0"/>
+            <wp:docPr id="584233709" name="Picture 1"/>
+            <wp:cNvGraphicFramePr>
+              <a:graphicFrameLocks xmlns:a="http://schemas.openxmlformats.org/drawingml/2006/main" noChangeAspect="1"/>
+            </wp:cNvGraphicFramePr>
+            <a:graphic xmlns:a="http://schemas.openxmlformats.org/drawingml/2006/main">
+              <a:graphicData uri="http://schemas.openxmlformats.org/drawingml/2006/picture">
+                <pic:pic xmlns:pic="http://schemas.openxmlformats.org/drawingml/2006/picture">
+                  <pic:nvPicPr>
+                    <pic:cNvPr id="584233709" name=""/>
+                    <pic:cNvPicPr/>
+                  </pic:nvPicPr>
+                  <pic:blipFill>
+                    <a:blip r:embed="rId9"/>
+                    <a:stretch>
+                      <a:fillRect/>
+                    </a:stretch>
+                  </pic:blipFill>
+                  <pic:spPr>
+                    <a:xfrm>
+                      <a:off x="0" y="0"/>
+                      <a:ext cx="5731510" cy="2402205"/>
+                    </a:xfrm>
+                    <a:prstGeom prst="rect">
+                      <a:avLst/>
+                    </a:prstGeom>
+                  </pic:spPr>
+                </pic:pic>
+              </a:graphicData>
+            </a:graphic>
+          </wp:inline>
+        </w:drawing>
+      </w:r>
+      <w:r>
+        <w:drawing>
+          <wp:inline distT="0" distB="0" distL="0" distR="0" wp14:anchorId="3309C577" wp14:editId="7AE26864">
+            <wp:extent cx="5731510" cy="2200275"/>
+            <wp:effectExtent l="0" t="0" r="2540" b="9525"/>
+            <wp:docPr id="443048417" name="Picture 1"/>
+            <wp:cNvGraphicFramePr>
+              <a:graphicFrameLocks xmlns:a="http://schemas.openxmlformats.org/drawingml/2006/main" noChangeAspect="1"/>
+            </wp:cNvGraphicFramePr>
+            <a:graphic xmlns:a="http://schemas.openxmlformats.org/drawingml/2006/main">
+              <a:graphicData uri="http://schemas.openxmlformats.org/drawingml/2006/picture">
+                <pic:pic xmlns:pic="http://schemas.openxmlformats.org/drawingml/2006/picture">
+                  <pic:nvPicPr>
+                    <pic:cNvPr id="443048417" name=""/>
+                    <pic:cNvPicPr/>
+                  </pic:nvPicPr>
+                  <pic:blipFill>
+                    <a:blip r:embed="rId10"/>
+                    <a:stretch>
+                      <a:fillRect/>
+                    </a:stretch>
+                  </pic:blipFill>
+                  <pic:spPr>
+                    <a:xfrm>
+                      <a:off x="0" y="0"/>
+                      <a:ext cx="5731510" cy="2200275"/>
+                    </a:xfrm>
+                    <a:prstGeom prst="rect">
+                      <a:avLst/>
+                    </a:prstGeom>
+                  </pic:spPr>
+                </pic:pic>
+              </a:graphicData>
+            </a:graphic>
+          </wp:inline>
+        </w:drawing>
+      </w:r>
+      <w:r>
+        <w:lastRenderedPageBreak/>
+        <w:drawing>
+          <wp:inline distT="0" distB="0" distL="0" distR="0" wp14:anchorId="1D94D84E" wp14:editId="706A9020">
+            <wp:extent cx="5731510" cy="3359150"/>
+            <wp:effectExtent l="0" t="0" r="2540" b="0"/>
+            <wp:docPr id="285173055" name="Picture 1"/>
+            <wp:cNvGraphicFramePr>
+              <a:graphicFrameLocks xmlns:a="http://schemas.openxmlformats.org/drawingml/2006/main" noChangeAspect="1"/>
+            </wp:cNvGraphicFramePr>
+            <a:graphic xmlns:a="http://schemas.openxmlformats.org/drawingml/2006/main">
+              <a:graphicData uri="http://schemas.openxmlformats.org/drawingml/2006/picture">
+                <pic:pic xmlns:pic="http://schemas.openxmlformats.org/drawingml/2006/picture">
+                  <pic:nvPicPr>
+                    <pic:cNvPr id="285173055" name=""/>
+                    <pic:cNvPicPr/>
+                  </pic:nvPicPr>
+                  <pic:blipFill>
+                    <a:blip r:embed="rId11"/>
+                    <a:stretch>
+                      <a:fillRect/>
+                    </a:stretch>
+                  </pic:blipFill>
+                  <pic:spPr>
+                    <a:xfrm>
+                      <a:off x="0" y="0"/>
+                      <a:ext cx="5731510" cy="3359150"/>
+                    </a:xfrm>
+                    <a:prstGeom prst="rect">
+                      <a:avLst/>
+                    </a:prstGeom>
+                  </pic:spPr>
+                </pic:pic>
+              </a:graphicData>
+            </a:graphic>
+          </wp:inline>
+        </w:drawing>
+      </w:r>
+      <w:r>
+        <w:drawing>
+          <wp:inline distT="0" distB="0" distL="0" distR="0" wp14:anchorId="648025A7" wp14:editId="337EF2FD">
+            <wp:extent cx="5731510" cy="2743835"/>
+            <wp:effectExtent l="0" t="0" r="2540" b="0"/>
+            <wp:docPr id="989263833" name="Picture 1"/>
+            <wp:cNvGraphicFramePr>
+              <a:graphicFrameLocks xmlns:a="http://schemas.openxmlformats.org/drawingml/2006/main" noChangeAspect="1"/>
+            </wp:cNvGraphicFramePr>
+            <a:graphic xmlns:a="http://schemas.openxmlformats.org/drawingml/2006/main">
+              <a:graphicData uri="http://schemas.openxmlformats.org/drawingml/2006/picture">
+                <pic:pic xmlns:pic="http://schemas.openxmlformats.org/drawingml/2006/picture">
+                  <pic:nvPicPr>
+                    <pic:cNvPr id="989263833" name=""/>
+                    <pic:cNvPicPr/>
+                  </pic:nvPicPr>
+                  <pic:blipFill>
+                    <a:blip r:embed="rId12"/>
+                    <a:stretch>
+                      <a:fillRect/>
+                    </a:stretch>
+                  </pic:blipFill>
+                  <pic:spPr>
+                    <a:xfrm>
+                      <a:off x="0" y="0"/>
+                      <a:ext cx="5731510" cy="2743835"/>
+                    </a:xfrm>
+                    <a:prstGeom prst="rect">
+                      <a:avLst/>
+                    </a:prstGeom>
+                  </pic:spPr>
+                </pic:pic>
+              </a:graphicData>
+            </a:graphic>
+          </wp:inline>
+        </w:drawing>
+      </w:r>
+      <w:r>
+        <w:drawing>
+          <wp:inline distT="0" distB="0" distL="0" distR="0" wp14:anchorId="6B16CEEE" wp14:editId="0BBF408D">
+            <wp:extent cx="5731510" cy="2531110"/>
+            <wp:effectExtent l="0" t="0" r="2540" b="2540"/>
+            <wp:docPr id="1211284619" name="Picture 1"/>
+            <wp:cNvGraphicFramePr>
+              <a:graphicFrameLocks xmlns:a="http://schemas.openxmlformats.org/drawingml/2006/main" noChangeAspect="1"/>
+            </wp:cNvGraphicFramePr>
+            <a:graphic xmlns:a="http://schemas.openxmlformats.org/drawingml/2006/main">
+              <a:graphicData uri="http://schemas.openxmlformats.org/drawingml/2006/picture">
+                <pic:pic xmlns:pic="http://schemas.openxmlformats.org/drawingml/2006/picture">
+                  <pic:nvPicPr>
+                    <pic:cNvPr id="1211284619" name=""/>
+                    <pic:cNvPicPr/>
+                  </pic:nvPicPr>
+                  <pic:blipFill>
+                    <a:blip r:embed="rId13"/>
+                    <a:stretch>
+                      <a:fillRect/>
+                    </a:stretch>
+                  </pic:blipFill>
+                  <pic:spPr>
+                    <a:xfrm>
+                      <a:off x="0" y="0"/>
+                      <a:ext cx="5731510" cy="2531110"/>
+                    </a:xfrm>
+                    <a:prstGeom prst="rect">
+                      <a:avLst/>
+                    </a:prstGeom>
+                  </pic:spPr>
+                </pic:pic>
+              </a:graphicData>
+            </a:graphic>
+          </wp:inline>
+        </w:drawing>
+      </w:r>
+    </w:p>
     <w:sectPr>
       <w:pgSz w:w="11906" w:h="16838"/>
       <w:pgMar w:top="1440" w:right="1440" w:bottom="1440" w:left="1440" w:header="720" w:footer="720" w:gutter="0"/>

</xml_diff>